<commit_message>
Drop Pipeboard; Meta via official MCP (pending BM URLs); Google Ads parked; GSC live
</commit_message>
<xml_diff>
--- a/Mad Minds - Employee Setup Guide.docx
+++ b/Mad Minds - Employee Setup Guide.docx
@@ -26,7 +26,7 @@
           <w:color w:val="808080"/>
           <w:sz w:val="20"/>
         </w:rPr>
-        <w:t>v0.7.1 — June 2026</w:t>
+        <w:t>v0.7.2 — June 2026</w:t>
       </w:r>
     </w:p>
     <w:p>
@@ -235,28 +235,26 @@
           <w:b/>
           <w:sz w:val="32"/>
         </w:rPr>
-        <w:t>Step 5 — Your ad &amp; SEO connectors are already built in</w:t>
+        <w:t>Step 5 — Your connectors (you just sign in)</w:t>
       </w:r>
     </w:p>
     <w:p>
       <w:r>
-        <w:t>Google Ads, Meta Ads, and Google Search Console come WITH the plugin — you do NOT install or add them, and there's nothing to paste.</w:t>
+        <w:t>Google Search Console is built into the plugin and live. Meta Ads connects through Meta's own official connector. You do NOT install or paste anything — you sign in to each the first time you use it (easiest via Step 6, /setup-marketing).</w:t>
       </w:r>
     </w:p>
     <w:p>
       <w:r>
-        <w:t>Important: if you open Customize → Onlineminds-marketing → Connectors you'll see them listed with an “Install” button. Ignore it — clicking Install shows “a server with this URL already exists”, because the plugin already provides them. Do NOT use “Add custom connector” either.</w:t>
+        <w:t>Important: if you open Customize → Onlineminds-marketing → Connectors you'll see connectors with an “Install” button. Ignore it — the plugin already provides them, and clicking Install just errors. Don't use “Add custom connector” either. You connect by signing in via the link Claude gives you in /setup-marketing.</w:t>
       </w:r>
     </w:p>
     <w:p>
       <w:r>
-        <w:t>Instead, you sign in to each one the first time you use it: Claude hands you a sign-in link. The easiest way to do all of them at once is Step 6 (/setup-marketing). You sign in once per connector — it stays connected after that.</w:t>
+        <w:t>Google Ads is NOT available yet — it's waiting on an IT approval that's out of your hands. Until then, you can still audit Google Ads by exporting a report and asking Claude to analyse it. Ahrefs and SimilarWeb run on a shared org key Nikolaj configures — nothing for you to do.</w:t>
       </w:r>
     </w:p>
     <w:p>
-      <w:r>
-        <w:t>(Ahrefs and SimilarWeb run on a shared org key that Nikolaj configures — you don't need to do anything for those.)</w:t>
-      </w:r>
+      <w:r/>
     </w:p>
     <w:p>
       <w:r>
@@ -301,7 +299,7 @@
         <w:pStyle w:val="ListBullet"/>
       </w:pPr>
       <w:r>
-        <w:t>Google Ads — opens Pipeboard (a free sign-in broker; first time only), then your Google account that has the brand's Google Ads.</w:t>
+        <w:t>Meta Ads — sign in with your Meta Business (Facebook) account that has your brand's ad accounts. This uses Meta's official connector — Facebook login, no Google involved.</w:t>
       </w:r>
     </w:p>
     <w:p>
@@ -309,7 +307,7 @@
         <w:pStyle w:val="ListBullet"/>
       </w:pPr>
       <w:r>
-        <w:t>Meta Ads — the same Pipeboard sign-in, then the Facebook account with Business Manager access.</w:t>
+        <w:t>Google Ads — coming later (waiting on an IT approval). Skip it for now.</w:t>
       </w:r>
     </w:p>
     <w:p>

</xml_diff>

<commit_message>
Remove Ahrefs from Mad Minds entirely (connector + all skill/doc references)
</commit_message>
<xml_diff>
--- a/Mad Minds - Employee Setup Guide.docx
+++ b/Mad Minds - Employee Setup Guide.docx
@@ -26,7 +26,7 @@
           <w:color w:val="808080"/>
           <w:sz w:val="20"/>
         </w:rPr>
-        <w:t>v0.7.2 — June 2026</w:t>
+        <w:t>v0.7.3 — June 2026</w:t>
       </w:r>
     </w:p>
     <w:p>
@@ -250,7 +250,7 @@
     </w:p>
     <w:p>
       <w:r>
-        <w:t>Google Ads is NOT available yet — it's waiting on an IT approval that's out of your hands. Until then, you can still audit Google Ads by exporting a report and asking Claude to analyse it. Ahrefs and SimilarWeb run on a shared org key Nikolaj configures — nothing for you to do.</w:t>
+        <w:t>Google Ads is NOT available yet — it's waiting on an IT approval that's out of your hands. Until then, you can still audit Google Ads by exporting a report and asking Claude to analyse it. SimilarWeb runs on a shared org key Nikolaj configures — nothing for you to do.</w:t>
       </w:r>
     </w:p>
     <w:p>

</xml_diff>

<commit_message>
Scope Mad Minds to live connectors (Drive, GSC, SimilarWeb); defer Meta/Google Ads/GA4/GTM/Merchant
</commit_message>
<xml_diff>
--- a/Mad Minds - Employee Setup Guide.docx
+++ b/Mad Minds - Employee Setup Guide.docx
@@ -26,17 +26,55 @@
           <w:color w:val="808080"/>
           <w:sz w:val="20"/>
         </w:rPr>
-        <w:t>v0.7.3 — June 2026</w:t>
+        <w:t>v0.8.0 — June 2026</w:t>
       </w:r>
     </w:p>
     <w:p>
       <w:r>
-        <w:t>This is everything you need to start using Mad Minds. All the technical hosting is already set up for you — there is no terminal, no developer steps, and nothing to paste. You install the plugins, sign in to your connectors with a few clicks, and go. About 10 minutes.</w:t>
+        <w:t>Everything technical is already set up for you — no terminal, no developer steps, nothing to paste. You install the plugins, sign in to a couple of connectors, and you're working. About 10 minutes.</w:t>
       </w:r>
     </w:p>
     <w:p>
       <w:r>
-        <w:t>If you get stuck on any step, screenshot what you see and send it to Nikolaj.</w:t>
+        <w:t>If anything doesn't match what you see on screen, screenshot it and send it to Nikolaj.</w:t>
+      </w:r>
+    </w:p>
+    <w:p>
+      <w:r>
+        <w:rPr>
+          <w:b/>
+          <w:sz w:val="32"/>
+        </w:rPr>
+        <w:t>What's live today</w:t>
+      </w:r>
+    </w:p>
+    <w:p>
+      <w:r>
+        <w:t>Right now the project connects to three things. Those are the steps below. Other connectors (Google Ads, Meta Ads, GA4, Tag Manager, Merchant Center) are coming and are NOT part of setup yet — don't try to connect them.</w:t>
+      </w:r>
+    </w:p>
+    <w:p>
+      <w:pPr>
+        <w:pStyle w:val="ListBullet"/>
+      </w:pPr>
+      <w:r>
+        <w:t>Google Drive — the shared Mad Minds Hub (where your work is read from and saved).</w:t>
+      </w:r>
+    </w:p>
+    <w:p>
+      <w:pPr>
+        <w:pStyle w:val="ListBullet"/>
+      </w:pPr>
+      <w:r>
+        <w:t>Google Search Console — your brands' organic search data (clicks, impressions, positions, URL inspection).</w:t>
+      </w:r>
+    </w:p>
+    <w:p>
+      <w:pPr>
+        <w:pStyle w:val="ListBullet"/>
+      </w:pPr>
+      <w:r>
+        <w:t>SimilarWeb — competitive traffic and market benchmarking (set up centrally — nothing for you to do).</w:t>
       </w:r>
     </w:p>
     <w:p>
@@ -50,7 +88,7 @@
     </w:p>
     <w:p>
       <w:r>
-        <w:t>Skip this if you already have the Claude desktop app and are signed in.</w:t>
+        <w:t>Skip if you already have it and are signed in.</w:t>
       </w:r>
     </w:p>
     <w:p>
@@ -58,15 +96,7 @@
         <w:pStyle w:val="ListBullet"/>
       </w:pPr>
       <w:r>
-        <w:t>Download: https://claude.ai/download</w:t>
-      </w:r>
-    </w:p>
-    <w:p>
-      <w:pPr>
-        <w:pStyle w:val="ListBullet"/>
-      </w:pPr>
-      <w:r>
-        <w:t>Install it and sign in (use your @onlineminds.io account if you have one).</w:t>
+        <w:t>Download: https://claude.ai/download — install and sign in (use your @onlineminds.io account if you have one).</w:t>
       </w:r>
     </w:p>
     <w:p>
@@ -80,7 +110,7 @@
     </w:p>
     <w:p>
       <w:r>
-        <w:t>In Claude desktop: Customize (top right) → Plugins → Personal → Add marketplace → Add from a repository → paste this URL:</w:t>
+        <w:t>Customize (top right) → Plugins → Personal → Add marketplace → Add from a repository → paste:</w:t>
       </w:r>
     </w:p>
     <w:p>
@@ -93,7 +123,7 @@
     </w:p>
     <w:p>
       <w:r>
-        <w:t>Two plugins appear. Click “+” to install both:</w:t>
+        <w:t>Two plugins appear — click “+” to install both:</w:t>
       </w:r>
     </w:p>
     <w:p>
@@ -101,7 +131,7 @@
         <w:pStyle w:val="ListBullet"/>
       </w:pPr>
       <w:r>
-        <w:t>onlineminds-marketing — OnlineMinds skills, the Google Drive Hub, the spend-gate that protects live ad accounts, AND all the ad/SEO connectors (already built in).</w:t>
+        <w:t>onlineminds-marketing — OnlineMinds skills, the Drive Hub, and the connectors.</w:t>
       </w:r>
     </w:p>
     <w:p>
@@ -109,7 +139,7 @@
         <w:pStyle w:val="ListBullet"/>
       </w:pPr>
       <w:r>
-        <w:t>claude-ads — open-source paid-advertising audit toolkit (250+ checks, health scores, reports).</w:t>
+        <w:t>claude-ads — paid-advertising audit toolkit (works on exported data; analysis-only).</w:t>
       </w:r>
     </w:p>
     <w:p>
@@ -119,11 +149,6 @@
           <w:sz w:val="32"/>
         </w:rPr>
         <w:t>Step 3 — Create your Mad Minds project in Cowork</w:t>
-      </w:r>
-    </w:p>
-    <w:p>
-      <w:r>
-        <w:t>A dedicated project keeps your work organised and loads the right context every session.</w:t>
       </w:r>
     </w:p>
     <w:p>
@@ -155,7 +180,7 @@
         <w:pStyle w:val="ListNumber"/>
       </w:pPr>
       <w:r>
-        <w:t>Workspace folder: create a folder like ~/Documents/Mad Minds and pick it. (It's just a session container — your real work is read from and written to the shared Mad Minds Drive.)</w:t>
+        <w:t>Workspace folder: create a folder like ~/Documents/Mad Minds and pick it (it's just a session container — your real work lives in the shared Drive).</w:t>
       </w:r>
     </w:p>
     <w:p>
@@ -178,7 +203,7 @@
         <w:br/>
         <w:t>Two plugins are installed:</w:t>
         <w:br/>
-        <w:t>- onlineminds-marketing: in-house skills, Drive Hub routing, the /ad-actions skill for live ad-account changes (with a non-overridable Tier 1 / Tier 2 spend-gate).</w:t>
+        <w:t>- onlineminds-marketing: in-house skills, Drive Hub routing, and (when ad connectors are live) the /ad-actions skill with a non-overridable Tier 1 / Tier 2 spend-gate.</w:t>
         <w:br/>
         <w:t>- claude-ads: open-source paid-advertising audit toolkit (analysis-only).</w:t>
         <w:br/>
@@ -186,11 +211,9 @@
         <w:br/>
         <w:t>- Load the account-conventions skill at the start of any marketing task. It holds the brand portfolio, KPI definitions, the Drive map, and the spend-gate rules.</w:t>
         <w:br/>
-        <w:t>- Brand-specific values (account IDs, KPI targets, currency, conversion definitions, brand voice) live in Mad Minds/01_Knowledge_Base/account-conventions-live. If a value is missing, ask me once in chat, then write it there so nobody gets re-asked.</w:t>
+        <w:t>- Brand-specific values live in Mad Minds/01_Knowledge_Base/account-conventions-live. If a value is missing, ask me once in chat, then write it there so nobody gets re-asked.</w:t>
         <w:br/>
-        <w:t>- Drafts auto-save to my personal folder: Mad Minds/07_People/&lt;my-name&gt;/, in the matching subfolder (reports/, plans/, data/, notes/). Move to shared folders only when I say "publish this to the team".</w:t>
-        <w:br/>
-        <w:t>- Ad write-actions go through the /ad-actions skill only. Spend increases require me to type a verbatim accept-phrase you construct (Tier 1, non-overridable). Lower-risk changes (pause, lower budget, add negatives) take a normal yes (Tier 2). I can say "read-only" anytime to lock the session into analysis-only mode.</w:t>
+        <w:t>- Drafts auto-save to my personal folder: Mad Minds/07_People/&lt;my-name&gt;/ (reports/, plans/, data/, notes/). Move to shared folders only when I say "publish this to the team".</w:t>
         <w:br/>
         <w:t>- Plain English works — I don't need slash commands. For substantial tasks ask 2-4 clarifying questions first.</w:t>
         <w:br/>
@@ -213,15 +236,7 @@
         <w:pStyle w:val="ListBullet"/>
       </w:pPr>
       <w:r>
-        <w:t>Customize → Connectors (the top-level one in the left sidebar).</w:t>
-      </w:r>
-    </w:p>
-    <w:p>
-      <w:pPr>
-        <w:pStyle w:val="ListBullet"/>
-      </w:pPr>
-      <w:r>
-        <w:t>Find Google Drive → Connect → sign in with your @onlineminds.io account.</w:t>
+        <w:t>Customize → Connectors (the top-level one) → Google Drive → Connect → sign in with your @onlineminds.io account.</w:t>
       </w:r>
     </w:p>
     <w:p>
@@ -235,34 +250,7 @@
           <w:b/>
           <w:sz w:val="32"/>
         </w:rPr>
-        <w:t>Step 5 — Your connectors (you just sign in)</w:t>
-      </w:r>
-    </w:p>
-    <w:p>
-      <w:r>
-        <w:t>Google Search Console is built into the plugin and live. Meta Ads connects through Meta's own official connector. You do NOT install or paste anything — you sign in to each the first time you use it (easiest via Step 6, /setup-marketing).</w:t>
-      </w:r>
-    </w:p>
-    <w:p>
-      <w:r>
-        <w:t>Important: if you open Customize → Onlineminds-marketing → Connectors you'll see connectors with an “Install” button. Ignore it — the plugin already provides them, and clicking Install just errors. Don't use “Add custom connector” either. You connect by signing in via the link Claude gives you in /setup-marketing.</w:t>
-      </w:r>
-    </w:p>
-    <w:p>
-      <w:r>
-        <w:t>Google Ads is NOT available yet — it's waiting on an IT approval that's out of your hands. Until then, you can still audit Google Ads by exporting a report and asking Claude to analyse it. SimilarWeb runs on a shared org key Nikolaj configures — nothing for you to do.</w:t>
-      </w:r>
-    </w:p>
-    <w:p>
-      <w:r/>
-    </w:p>
-    <w:p>
-      <w:r>
-        <w:rPr>
-          <w:b/>
-          <w:sz w:val="32"/>
-        </w:rPr>
-        <w:t>Step 6 — Run /setup-marketing (this is where you sign in)</w:t>
+        <w:t>Step 5 — Run /setup-marketing (this signs you into Search Console)</w:t>
       </w:r>
     </w:p>
     <w:p>
@@ -283,7 +271,7 @@
     </w:p>
     <w:p>
       <w:r>
-        <w:t>For each connector you need, Claude gives you a sign-in link. Click it, sign in, approve:</w:t>
+        <w:t>It checks your connectors, sets up your personal folder, and gives a short tour. For Google Search Console it hands you a sign-in link:</w:t>
       </w:r>
     </w:p>
     <w:p>
@@ -291,7 +279,7 @@
         <w:pStyle w:val="ListBullet"/>
       </w:pPr>
       <w:r>
-        <w:t>Google Search Console — a direct Google sign-in. Pick the Google account that has your brand's Search Console. You only ever see your own verified properties.</w:t>
+        <w:t>Click the link, sign in with the Google account that has your brand's Search Console, and click Allow.</w:t>
       </w:r>
     </w:p>
     <w:p>
@@ -299,20 +287,12 @@
         <w:pStyle w:val="ListBullet"/>
       </w:pPr>
       <w:r>
-        <w:t>Meta Ads — sign in with your Meta Business (Facebook) account that has your brand's ad accounts. This uses Meta's official connector — Facebook login, no Google involved.</w:t>
-      </w:r>
-    </w:p>
-    <w:p>
-      <w:pPr>
-        <w:pStyle w:val="ListBullet"/>
-      </w:pPr>
-      <w:r>
-        <w:t>Google Ads — coming later (waiting on an IT approval). Skip it for now.</w:t>
+        <w:t>Let it finish on its own — don't paste anything back unless Claude asks. You sign in once; it stays connected.</w:t>
       </w:r>
     </w:p>
     <w:p>
       <w:r>
-        <w:t>/setup-marketing also creates your personal folder (07_People/&lt;your-name&gt;/) and gives you a quick tour. If a connector ever needs re-signing-in, Claude just hands you the link again.</w:t>
+        <w:t>SimilarWeb is already set up centrally, so there's nothing to connect for it. Note: you do NOT use the Connectors panel “Install”/“Add custom connector” for these — just use the sign-in link from /setup-marketing.</w:t>
       </w:r>
     </w:p>
     <w:p>
@@ -321,12 +301,12 @@
           <w:b/>
           <w:sz w:val="32"/>
         </w:rPr>
-        <w:t>Step 7 — Try a real query</w:t>
+        <w:t>Step 6 — Try a real query</w:t>
       </w:r>
     </w:p>
     <w:p>
       <w:r>
-        <w:t>Anything in plain English, for example:</w:t>
+        <w:t>Plain English, for example:</w:t>
       </w:r>
     </w:p>
     <w:p>
@@ -342,7 +322,7 @@
         <w:pStyle w:val="ListBullet"/>
       </w:pPr>
       <w:r>
-        <w:t>How is Jacob Lund Art's organic search trending in DK?</w:t>
+        <w:t>How is Jacob Lund Art's organic search trending in DK over the last 90 days?</w:t>
       </w:r>
     </w:p>
     <w:p>
@@ -350,7 +330,7 @@
         <w:pStyle w:val="ListBullet"/>
       </w:pPr>
       <w:r>
-        <w:t>Show me Rentumo's spend last week on Google Ads</w:t>
+        <w:t>Which Rentumo pages lost the most clicks last month?</w:t>
       </w:r>
     </w:p>
     <w:p>
@@ -358,12 +338,42 @@
         <w:pStyle w:val="ListBullet"/>
       </w:pPr>
       <w:r>
-        <w:t>Do a quick audit on Printumo's paid performance</w:t>
+        <w:t>Give me a competitive traffic snapshot for &lt;brand&gt; vs its main rivals (SimilarWeb)</w:t>
       </w:r>
     </w:p>
     <w:p>
       <w:r>
-        <w:t>If Claude needs a specific value (like a brand's Google Ads account ID), it asks once in chat and saves it to the shared account-conventions-live doc — so nobody is asked again.</w:t>
+        <w:t>If Claude needs a specific value (like a property URL), it asks once and saves it to the shared account-conventions-live doc so nobody is asked again.</w:t>
+      </w:r>
+    </w:p>
+    <w:p>
+      <w:r>
+        <w:rPr>
+          <w:b/>
+          <w:sz w:val="32"/>
+        </w:rPr>
+        <w:t>Coming soon (don't try to connect these yet)</w:t>
+      </w:r>
+    </w:p>
+    <w:p>
+      <w:pPr>
+        <w:pStyle w:val="ListBullet"/>
+      </w:pPr>
+      <w:r>
+        <w:t>Google Ads &amp; Meta Ads — live campaign data and management. Pending setup. For now, export a report from Ads Manager and ask Claude to audit it (the claude-ads toolkit works on exports).</w:t>
+      </w:r>
+    </w:p>
+    <w:p>
+      <w:pPr>
+        <w:pStyle w:val="ListBullet"/>
+      </w:pPr>
+      <w:r>
+        <w:t>GA4, Google Tag Manager, Merchant Center — not wired yet.</w:t>
+      </w:r>
+    </w:p>
+    <w:p>
+      <w:r>
+        <w:t>When these come online you'll get the same one-click sign-in, plus the ability to pause campaigns and change budgets/bids — and those actions will be protected by a typed-confirmation spend-gate. None of that is active today.</w:t>
       </w:r>
     </w:p>
     <w:p>
@@ -377,45 +387,7 @@
     </w:p>
     <w:p>
       <w:r>
-        <w:t>Your drafts save automatically to Mad Minds/07_People/&lt;your-name&gt;/, sorted into reports/, plans/, data/, notes/. When something is finished and useful to the team, say “publish this to the team” and Claude copies the final version into the shared folder. Every session reads fresh from Drive — no syncing, no local files to manage.</w:t>
-      </w:r>
-    </w:p>
-    <w:p>
-      <w:r>
-        <w:rPr>
-          <w:b/>
-          <w:sz w:val="32"/>
-        </w:rPr>
-        <w:t>Taking actions — the safety gate</w:t>
-      </w:r>
-    </w:p>
-    <w:p>
-      <w:r>
-        <w:t>You can pause campaigns, change budgets and bids, add negative keywords, and create ads on Google + Meta. Claude acts as you, so you can only touch accounts you already have access to.</w:t>
-      </w:r>
-    </w:p>
-    <w:p>
-      <w:pPr>
-        <w:pStyle w:val="ListBullet"/>
-      </w:pPr>
-      <w:r>
-        <w:t>Spend increases (budget up, bid up, enabling a campaign, launching an ad) require you to type a confirmation sentence Claude shows you, word-for-word. A plain “yes” will not trigger them — on purpose.</w:t>
-      </w:r>
-    </w:p>
-    <w:p>
-      <w:pPr>
-        <w:pStyle w:val="ListBullet"/>
-      </w:pPr>
-      <w:r>
-        <w:t>Lower-risk changes (pausing, lowering a budget, adding negatives) just need a normal “yes”.</w:t>
-      </w:r>
-    </w:p>
-    <w:p>
-      <w:pPr>
-        <w:pStyle w:val="ListBullet"/>
-      </w:pPr>
-      <w:r>
-        <w:t>Say “read-only” at the start of a session to make it analysis-only.</w:t>
+        <w:t>Drafts save automatically to Mad Minds/07_People/&lt;your-name&gt;/ (reports/, plans/, data/, notes/). When something's finished, say “publish this to the team” and Claude copies the final version into the shared folder. Every session reads fresh from Drive — no syncing, no local files.</w:t>
       </w:r>
     </w:p>
     <w:p>
@@ -432,7 +404,7 @@
         <w:pStyle w:val="ListBullet"/>
       </w:pPr>
       <w:r>
-        <w:t>A connector won't sign in → screenshot the error and send it to Nikolaj.</w:t>
+        <w:t>Google Search Console won't sign in (a localhost page won't load, then an error) → screenshot it and tell Nikolaj.</w:t>
       </w:r>
     </w:p>
     <w:p>
@@ -448,7 +420,7 @@
         <w:pStyle w:val="ListBullet"/>
       </w:pPr>
       <w:r>
-        <w:t>Don't use the Connectors panel “Install”/“Add custom connector” for the ad/SEO connectors — they're already provided by the plugin; sign in via /setup-marketing instead.</w:t>
+        <w:t>Don't use the Connectors panel “Install”/“Add custom connector” for the plugin connectors — sign in via /setup-marketing instead.</w:t>
       </w:r>
     </w:p>
     <w:sectPr>

</xml_diff>

<commit_message>
Remove SimilarWeb (paid-only API, no free access); Google Ads live; tidy docs
</commit_message>
<xml_diff>
--- a/Mad Minds - Employee Setup Guide.docx
+++ b/Mad Minds - Employee Setup Guide.docx
@@ -26,12 +26,12 @@
           <w:color w:val="808080"/>
           <w:sz w:val="20"/>
         </w:rPr>
-        <w:t>v0.8.0 — June 2026</w:t>
+        <w:t>v0.9.1 — June 2026</w:t>
       </w:r>
     </w:p>
     <w:p>
       <w:r>
-        <w:t>Everything technical is already set up for you — no terminal, no developer steps, nothing to paste. You install the plugins, sign in to a couple of connectors, and you're working. About 10 minutes.</w:t>
+        <w:t>Everything technical is already set up for you — no terminal, no developer steps, nothing to paste. You install the plugins, sign in to a few connectors, and you're working. About 10 minutes.</w:t>
       </w:r>
     </w:p>
     <w:p>
@@ -50,7 +50,7 @@
     </w:p>
     <w:p>
       <w:r>
-        <w:t>Right now the project connects to three things. Those are the steps below. Other connectors (Google Ads, Meta Ads, GA4, Tag Manager, Merchant Center) are coming and are NOT part of setup yet — don't try to connect them.</w:t>
+        <w:t>The project connects to three things — those are the steps below. Other connectors (Meta Ads, GA4, Tag Manager, Merchant Center) are coming and are NOT part of setup yet — don't try to connect them.</w:t>
       </w:r>
     </w:p>
     <w:p>
@@ -74,7 +74,7 @@
         <w:pStyle w:val="ListBullet"/>
       </w:pPr>
       <w:r>
-        <w:t>SimilarWeb — competitive traffic and market benchmarking (set up centrally — nothing for you to do).</w:t>
+        <w:t>Google Ads — campaign reporting and management for the accounts your Google login can access.</w:t>
       </w:r>
     </w:p>
     <w:p>
@@ -131,7 +131,7 @@
         <w:pStyle w:val="ListBullet"/>
       </w:pPr>
       <w:r>
-        <w:t>onlineminds-marketing — OnlineMinds skills, the Drive Hub, and the connectors.</w:t>
+        <w:t>onlineminds-marketing — OnlineMinds skills, the Drive Hub, the connectors, and the spend-gate that protects live ad accounts.</w:t>
       </w:r>
     </w:p>
     <w:p>
@@ -139,7 +139,7 @@
         <w:pStyle w:val="ListBullet"/>
       </w:pPr>
       <w:r>
-        <w:t>claude-ads — paid-advertising audit toolkit (works on exported data; analysis-only).</w:t>
+        <w:t>claude-ads — paid-advertising audit toolkit (250+ checks, health scores, reports).</w:t>
       </w:r>
     </w:p>
     <w:p>
@@ -203,7 +203,7 @@
         <w:br/>
         <w:t>Two plugins are installed:</w:t>
         <w:br/>
-        <w:t>- onlineminds-marketing: in-house skills, Drive Hub routing, and (when ad connectors are live) the /ad-actions skill with a non-overridable Tier 1 / Tier 2 spend-gate.</w:t>
+        <w:t>- onlineminds-marketing: in-house skills, Drive Hub routing, and the /ad-actions skill for live ad-account changes (with a non-overridable Tier 1 / Tier 2 spend-gate).</w:t>
         <w:br/>
         <w:t>- claude-ads: open-source paid-advertising audit toolkit (analysis-only).</w:t>
         <w:br/>
@@ -214,6 +214,8 @@
         <w:t>- Brand-specific values live in Mad Minds/01_Knowledge_Base/account-conventions-live. If a value is missing, ask me once in chat, then write it there so nobody gets re-asked.</w:t>
         <w:br/>
         <w:t>- Drafts auto-save to my personal folder: Mad Minds/07_People/&lt;my-name&gt;/ (reports/, plans/, data/, notes/). Move to shared folders only when I say "publish this to the team".</w:t>
+        <w:br/>
+        <w:t>- Ad write-actions go through the /ad-actions skill only. Spend increases require me to type a verbatim accept-phrase you construct (Tier 1). Lower-risk changes (pause, lower budget, add negatives) take a normal yes (Tier 2). I can say "read-only" anytime.</w:t>
         <w:br/>
         <w:t>- Plain English works — I don't need slash commands. For substantial tasks ask 2-4 clarifying questions first.</w:t>
         <w:br/>
@@ -250,7 +252,7 @@
           <w:b/>
           <w:sz w:val="32"/>
         </w:rPr>
-        <w:t>Step 5 — Run /setup-marketing (this signs you into Search Console)</w:t>
+        <w:t>Step 5 — Run /setup-marketing (this signs you into the rest)</w:t>
       </w:r>
     </w:p>
     <w:p>
@@ -271,7 +273,7 @@
     </w:p>
     <w:p>
       <w:r>
-        <w:t>It checks your connectors, sets up your personal folder, and gives a short tour. For Google Search Console it hands you a sign-in link:</w:t>
+        <w:t>It checks your connectors, sets up your personal folder, and gives a short tour. For Google Search Console and Google Ads it hands you a sign-in link:</w:t>
       </w:r>
     </w:p>
     <w:p>
@@ -279,7 +281,7 @@
         <w:pStyle w:val="ListBullet"/>
       </w:pPr>
       <w:r>
-        <w:t>Click the link, sign in with the Google account that has your brand's Search Console, and click Allow.</w:t>
+        <w:t>Click the link, sign in with the Google account that has access (your Search Console properties / your Google Ads accounts), and click Allow.</w:t>
       </w:r>
     </w:p>
     <w:p>
@@ -292,7 +294,7 @@
     </w:p>
     <w:p>
       <w:r>
-        <w:t>SimilarWeb is already set up centrally, so there's nothing to connect for it. Note: you do NOT use the Connectors panel “Install”/“Add custom connector” for these — just use the sign-in link from /setup-marketing.</w:t>
+        <w:t>You do NOT use the Connectors panel “Install”/“Add custom connector” for these; just use the sign-in links from /setup-marketing.</w:t>
       </w:r>
     </w:p>
     <w:p>
@@ -322,7 +324,7 @@
         <w:pStyle w:val="ListBullet"/>
       </w:pPr>
       <w:r>
-        <w:t>How is Jacob Lund Art's organic search trending in DK over the last 90 days?</w:t>
+        <w:t>Show me Rentumo's Google Ads spend and conversions over the last 7 days</w:t>
       </w:r>
     </w:p>
     <w:p>
@@ -330,7 +332,7 @@
         <w:pStyle w:val="ListBullet"/>
       </w:pPr>
       <w:r>
-        <w:t>Which Rentumo pages lost the most clicks last month?</w:t>
+        <w:t>Which Rentumo pages lost the most organic clicks last month?</w:t>
       </w:r>
     </w:p>
     <w:p>
@@ -338,12 +340,55 @@
         <w:pStyle w:val="ListBullet"/>
       </w:pPr>
       <w:r>
-        <w:t>Give me a competitive traffic snapshot for &lt;brand&gt; vs its main rivals (SimilarWeb)</w:t>
+        <w:t>Audit Printumo's Google Ads for wasted spend</w:t>
       </w:r>
     </w:p>
     <w:p>
       <w:r>
-        <w:t>If Claude needs a specific value (like a property URL), it asks once and saves it to the shared account-conventions-live doc so nobody is asked again.</w:t>
+        <w:t>If Claude needs a specific value (like an account ID), it asks once and saves it to the shared account-conventions-live doc so nobody is asked again.</w:t>
+      </w:r>
+    </w:p>
+    <w:p>
+      <w:r>
+        <w:rPr>
+          <w:b/>
+          <w:sz w:val="32"/>
+        </w:rPr>
+        <w:t>Taking actions on Google Ads — the safety gate</w:t>
+      </w:r>
+    </w:p>
+    <w:p>
+      <w:r>
+        <w:t>Beyond reporting, you can pause campaigns, change budgets and bids, add negatives, and create ads on Google Ads. Claude acts as you, so you can only touch accounts you already have access to.</w:t>
+      </w:r>
+    </w:p>
+    <w:p>
+      <w:pPr>
+        <w:pStyle w:val="ListBullet"/>
+      </w:pPr>
+      <w:r>
+        <w:t>Spend increases (budget up, bid up, enabling a campaign, launching an ad) require you to type a confirmation sentence Claude shows you, word-for-word. A plain “yes” will not trigger them — on purpose.</w:t>
+      </w:r>
+    </w:p>
+    <w:p>
+      <w:pPr>
+        <w:pStyle w:val="ListBullet"/>
+      </w:pPr>
+      <w:r>
+        <w:t>Lower-risk changes (pausing, lowering a budget, adding negatives) just need a normal “yes”.</w:t>
+      </w:r>
+    </w:p>
+    <w:p>
+      <w:pPr>
+        <w:pStyle w:val="ListBullet"/>
+      </w:pPr>
+      <w:r>
+        <w:t>Say “read-only” at the start of a session to make it analysis-only.</w:t>
+      </w:r>
+    </w:p>
+    <w:p>
+      <w:r>
+        <w:t>(Write actions may be in simulate mode during initial rollout — Claude will tell you if a change was simulated rather than applied.)</w:t>
       </w:r>
     </w:p>
     <w:p>
@@ -360,7 +405,7 @@
         <w:pStyle w:val="ListBullet"/>
       </w:pPr>
       <w:r>
-        <w:t>Google Ads &amp; Meta Ads — live campaign data and management. Pending setup. For now, export a report from Ads Manager and ask Claude to audit it (the claude-ads toolkit works on exports).</w:t>
+        <w:t>Meta Ads — Facebook/Instagram campaign data and management. Being set up.</w:t>
       </w:r>
     </w:p>
     <w:p>
@@ -369,11 +414,6 @@
       </w:pPr>
       <w:r>
         <w:t>GA4, Google Tag Manager, Merchant Center — not wired yet.</w:t>
-      </w:r>
-    </w:p>
-    <w:p>
-      <w:r>
-        <w:t>When these come online you'll get the same one-click sign-in, plus the ability to pause campaigns and change budgets/bids — and those actions will be protected by a typed-confirmation spend-gate. None of that is active today.</w:t>
       </w:r>
     </w:p>
     <w:p>
@@ -404,7 +444,7 @@
         <w:pStyle w:val="ListBullet"/>
       </w:pPr>
       <w:r>
-        <w:t>Google Search Console won't sign in (a localhost page won't load, then an error) → screenshot it and tell Nikolaj.</w:t>
+        <w:t>A connector won't sign in (a localhost page won't load, then an error) → screenshot it and tell Nikolaj.</w:t>
       </w:r>
     </w:p>
     <w:p>

</xml_diff>

<commit_message>
Switch GSC + Google Ads to custom-connector delivery (plugin in-session OAuth is a known Claude-desktop bug); remove SimilarWeb
</commit_message>
<xml_diff>
--- a/Mad Minds - Employee Setup Guide.docx
+++ b/Mad Minds - Employee Setup Guide.docx
@@ -26,12 +26,12 @@
           <w:color w:val="808080"/>
           <w:sz w:val="20"/>
         </w:rPr>
-        <w:t>v0.9.1 — June 2026</w:t>
+        <w:t>v0.9.2 — June 2026</w:t>
       </w:r>
     </w:p>
     <w:p>
       <w:r>
-        <w:t>Everything technical is already set up for you — no terminal, no developer steps, nothing to paste. You install the plugins, sign in to a few connectors, and you're working. About 10 minutes.</w:t>
+        <w:t>Everything technical is already set up for you — no terminal, no developer steps. You install the plugins, add a few connectors, sign in, and you're working. About 10 minutes.</w:t>
       </w:r>
     </w:p>
     <w:p>
@@ -50,7 +50,7 @@
     </w:p>
     <w:p>
       <w:r>
-        <w:t>The project connects to three things — those are the steps below. Other connectors (Meta Ads, GA4, Tag Manager, Merchant Center) are coming and are NOT part of setup yet — don't try to connect them.</w:t>
+        <w:t>Three connectors — the steps below. Other connectors (Meta Ads, GA4, Tag Manager, Merchant Center) are coming and are NOT part of setup yet.</w:t>
       </w:r>
     </w:p>
     <w:p>
@@ -58,7 +58,7 @@
         <w:pStyle w:val="ListBullet"/>
       </w:pPr>
       <w:r>
-        <w:t>Google Drive — the shared Mad Minds Hub (where your work is read from and saved).</w:t>
+        <w:t>Google Drive — the shared Mad Minds Hub.</w:t>
       </w:r>
     </w:p>
     <w:p>
@@ -66,7 +66,7 @@
         <w:pStyle w:val="ListBullet"/>
       </w:pPr>
       <w:r>
-        <w:t>Google Search Console — your brands' organic search data (clicks, impressions, positions, URL inspection).</w:t>
+        <w:t>Google Search Console — your brands' organic search data (read-only).</w:t>
       </w:r>
     </w:p>
     <w:p>
@@ -74,7 +74,7 @@
         <w:pStyle w:val="ListBullet"/>
       </w:pPr>
       <w:r>
-        <w:t>Google Ads — campaign reporting and management for the accounts your Google login can access.</w:t>
+        <w:t>Google Ads — campaign reporting and management for accounts your Google login can access.</w:t>
       </w:r>
     </w:p>
     <w:p>
@@ -84,11 +84,6 @@
           <w:sz w:val="32"/>
         </w:rPr>
         <w:t>Step 1 — Install Claude desktop</w:t>
-      </w:r>
-    </w:p>
-    <w:p>
-      <w:r>
-        <w:t>Skip if you already have it and are signed in.</w:t>
       </w:r>
     </w:p>
     <w:p>
@@ -123,23 +118,7 @@
     </w:p>
     <w:p>
       <w:r>
-        <w:t>Two plugins appear — click “+” to install both:</w:t>
-      </w:r>
-    </w:p>
-    <w:p>
-      <w:pPr>
-        <w:pStyle w:val="ListBullet"/>
-      </w:pPr>
-      <w:r>
-        <w:t>onlineminds-marketing — OnlineMinds skills, the Drive Hub, the connectors, and the spend-gate that protects live ad accounts.</w:t>
-      </w:r>
-    </w:p>
-    <w:p>
-      <w:pPr>
-        <w:pStyle w:val="ListBullet"/>
-      </w:pPr>
-      <w:r>
-        <w:t>claude-ads — paid-advertising audit toolkit (250+ checks, health scores, reports).</w:t>
+        <w:t>Install both: onlineminds-marketing and claude-ads.</w:t>
       </w:r>
     </w:p>
     <w:p>
@@ -156,15 +135,7 @@
         <w:pStyle w:val="ListNumber"/>
       </w:pPr>
       <w:r>
-        <w:t>Open Cowork (the desktop app).</w:t>
-      </w:r>
-    </w:p>
-    <w:p>
-      <w:pPr>
-        <w:pStyle w:val="ListNumber"/>
-      </w:pPr>
-      <w:r>
-        <w:t>Click + New project.</w:t>
+        <w:t>Open Cowork → + New project.</w:t>
       </w:r>
     </w:p>
     <w:p>
@@ -180,7 +151,7 @@
         <w:pStyle w:val="ListNumber"/>
       </w:pPr>
       <w:r>
-        <w:t>Workspace folder: create a folder like ~/Documents/Mad Minds and pick it (it's just a session container — your real work lives in the shared Drive).</w:t>
+        <w:t>Workspace folder: create ~/Documents/Mad Minds and pick it.</w:t>
       </w:r>
     </w:p>
     <w:p>
@@ -188,7 +159,7 @@
         <w:pStyle w:val="ListNumber"/>
       </w:pPr>
       <w:r>
-        <w:t>Project instructions: paste the exact block below into the Instructions field.</w:t>
+        <w:t>Project instructions: paste the exact block below.</w:t>
       </w:r>
     </w:p>
     <w:p>
@@ -209,15 +180,15 @@
         <w:br/>
         <w:t>House rules:</w:t>
         <w:br/>
-        <w:t>- Load the account-conventions skill at the start of any marketing task. It holds the brand portfolio, KPI definitions, the Drive map, and the spend-gate rules.</w:t>
+        <w:t>- Load the account-conventions skill at the start of any marketing task.</w:t>
         <w:br/>
-        <w:t>- Brand-specific values live in Mad Minds/01_Knowledge_Base/account-conventions-live. If a value is missing, ask me once in chat, then write it there so nobody gets re-asked.</w:t>
+        <w:t>- Brand-specific values live in Mad Minds/01_Knowledge_Base/account-conventions-live. If a value is missing, ask me once, then write it there.</w:t>
         <w:br/>
-        <w:t>- Drafts auto-save to my personal folder: Mad Minds/07_People/&lt;my-name&gt;/ (reports/, plans/, data/, notes/). Move to shared folders only when I say "publish this to the team".</w:t>
+        <w:t>- Drafts auto-save to my personal folder: Mad Minds/07_People/&lt;my-name&gt;/. Move to shared folders only when I say "publish this to the team".</w:t>
         <w:br/>
-        <w:t>- Ad write-actions go through the /ad-actions skill only. Spend increases require me to type a verbatim accept-phrase you construct (Tier 1). Lower-risk changes (pause, lower budget, add negatives) take a normal yes (Tier 2). I can say "read-only" anytime.</w:t>
+        <w:t>- Ad write-actions go through /ad-actions only. Spend increases require me to type a verbatim accept-phrase (Tier 1). Lower-risk changes take a normal yes (Tier 2). I can say "read-only" anytime.</w:t>
         <w:br/>
-        <w:t>- Plain English works — I don't need slash commands. For substantial tasks ask 2-4 clarifying questions first.</w:t>
+        <w:t>- Plain English works. For substantial tasks ask 2-4 clarifying questions first.</w:t>
         <w:br/>
         <w:t>Brands: rentumo, adsumo, printumo, bidumo, monetumo, photumo, jla (Jacob Lund Art). Use "portfolio" for cross-brand work.</w:t>
         <w:br/>
@@ -238,12 +209,7 @@
         <w:pStyle w:val="ListBullet"/>
       </w:pPr>
       <w:r>
-        <w:t>Customize → Connectors (the top-level one) → Google Drive → Connect → sign in with your @onlineminds.io account.</w:t>
-      </w:r>
-    </w:p>
-    <w:p>
-      <w:r>
-        <w:t>This is the only connector you connect from the Connectors panel.</w:t>
+        <w:t>Customize → Connectors → Google Drive → Connect → sign in with @onlineminds.io.</w:t>
       </w:r>
     </w:p>
     <w:p>
@@ -252,7 +218,12 @@
           <w:b/>
           <w:sz w:val="32"/>
         </w:rPr>
-        <w:t>Step 5 — Run /setup-marketing (this signs you into the rest)</w:t>
+        <w:t>Step 5 — Add Google Search Console and Google Ads (custom connectors)</w:t>
+      </w:r>
+    </w:p>
+    <w:p>
+      <w:r>
+        <w:t>These two are added by URL. In Customize → Connectors, click Add custom connector and add each one:</w:t>
       </w:r>
     </w:p>
     <w:p>
@@ -260,7 +231,7 @@
         <w:pStyle w:val="ListNumber"/>
       </w:pPr>
       <w:r>
-        <w:t>Open your Mad Minds project and start a new session.</w:t>
+        <w:t>Add custom connector → URL: https://onlineminds-gsc-mcp.fly.dev/mcp → leave Advanced settings empty → Add → Connect → sign in with the Google account that has your Search Console.</w:t>
       </w:r>
     </w:p>
     <w:p>
@@ -268,33 +239,12 @@
         <w:pStyle w:val="ListNumber"/>
       </w:pPr>
       <w:r>
-        <w:t>Type: /setup-marketing</w:t>
+        <w:t>Add custom connector → URL: https://onlineminds-gads-mcp.fly.dev/mcp → leave Advanced settings empty → Add → Connect → sign in with the Google account that has your Google Ads.</w:t>
       </w:r>
     </w:p>
     <w:p>
       <w:r>
-        <w:t>It checks your connectors, sets up your personal folder, and gives a short tour. For Google Search Console and Google Ads it hands you a sign-in link:</w:t>
-      </w:r>
-    </w:p>
-    <w:p>
-      <w:pPr>
-        <w:pStyle w:val="ListBullet"/>
-      </w:pPr>
-      <w:r>
-        <w:t>Click the link, sign in with the Google account that has access (your Search Console properties / your Google Ads accounts), and click Allow.</w:t>
-      </w:r>
-    </w:p>
-    <w:p>
-      <w:pPr>
-        <w:pStyle w:val="ListBullet"/>
-      </w:pPr>
-      <w:r>
-        <w:t>Let it finish on its own — don't paste anything back unless Claude asks. You sign in once; it stays connected.</w:t>
-      </w:r>
-    </w:p>
-    <w:p>
-      <w:r>
-        <w:t>You do NOT use the Connectors panel “Install”/“Add custom connector” for these; just use the sign-in links from /setup-marketing.</w:t>
+        <w:t>Notes: there's nothing to paste besides the URL (no client ID/secret). You sign in once. If a connector's tools don't show up right away, start a new session. Don't use any “Install” button or an in-session sign-in link for these — only the Add custom connector path above works reliably.</w:t>
       </w:r>
     </w:p>
     <w:p>
@@ -303,12 +253,21 @@
           <w:b/>
           <w:sz w:val="32"/>
         </w:rPr>
-        <w:t>Step 6 — Try a real query</w:t>
+        <w:t>Step 6 — Run /setup-marketing</w:t>
       </w:r>
     </w:p>
     <w:p>
       <w:r>
-        <w:t>Plain English, for example:</w:t>
+        <w:t>Open your Mad Minds project, start a new session, type /setup-marketing. It confirms your connectors, sets up your personal folder (07_People/&lt;your-name&gt;/), and gives a short tour.</w:t>
+      </w:r>
+    </w:p>
+    <w:p>
+      <w:r>
+        <w:rPr>
+          <w:b/>
+          <w:sz w:val="32"/>
+        </w:rPr>
+        <w:t>Step 7 — Try a real query</w:t>
       </w:r>
     </w:p>
     <w:p>
@@ -336,19 +295,6 @@
       </w:r>
     </w:p>
     <w:p>
-      <w:pPr>
-        <w:pStyle w:val="ListBullet"/>
-      </w:pPr>
-      <w:r>
-        <w:t>Audit Printumo's Google Ads for wasted spend</w:t>
-      </w:r>
-    </w:p>
-    <w:p>
-      <w:r>
-        <w:t>If Claude needs a specific value (like an account ID), it asks once and saves it to the shared account-conventions-live doc so nobody is asked again.</w:t>
-      </w:r>
-    </w:p>
-    <w:p>
       <w:r>
         <w:rPr>
           <w:b/>
@@ -359,7 +305,7 @@
     </w:p>
     <w:p>
       <w:r>
-        <w:t>Beyond reporting, you can pause campaigns, change budgets and bids, add negatives, and create ads on Google Ads. Claude acts as you, so you can only touch accounts you already have access to.</w:t>
+        <w:t>You can pause campaigns, change budgets/bids, add negatives, create ads. Claude acts as you, so you only touch accounts you already have access to.</w:t>
       </w:r>
     </w:p>
     <w:p>
@@ -367,7 +313,7 @@
         <w:pStyle w:val="ListBullet"/>
       </w:pPr>
       <w:r>
-        <w:t>Spend increases (budget up, bid up, enabling a campaign, launching an ad) require you to type a confirmation sentence Claude shows you, word-for-word. A plain “yes” will not trigger them — on purpose.</w:t>
+        <w:t>Spend increases require you to type a confirmation sentence Claude shows you, word-for-word. A plain “yes” won't trigger them.</w:t>
       </w:r>
     </w:p>
     <w:p>
@@ -375,7 +321,7 @@
         <w:pStyle w:val="ListBullet"/>
       </w:pPr>
       <w:r>
-        <w:t>Lower-risk changes (pausing, lowering a budget, adding negatives) just need a normal “yes”.</w:t>
+        <w:t>Pausing / lowering a budget / adding negatives just need a normal “yes”.</w:t>
       </w:r>
     </w:p>
     <w:p>
@@ -383,12 +329,7 @@
         <w:pStyle w:val="ListBullet"/>
       </w:pPr>
       <w:r>
-        <w:t>Say “read-only” at the start of a session to make it analysis-only.</w:t>
-      </w:r>
-    </w:p>
-    <w:p>
-      <w:r>
-        <w:t>(Write actions may be in simulate mode during initial rollout — Claude will tell you if a change was simulated rather than applied.)</w:t>
+        <w:t>Say “read-only” at the start of a session to make it analysis-only. (Writes may be in simulate mode during rollout — Claude will tell you if a change was simulated.)</w:t>
       </w:r>
     </w:p>
     <w:p>
@@ -405,7 +346,7 @@
         <w:pStyle w:val="ListBullet"/>
       </w:pPr>
       <w:r>
-        <w:t>Meta Ads — Facebook/Instagram campaign data and management. Being set up.</w:t>
+        <w:t>Meta Ads — being set up.</w:t>
       </w:r>
     </w:p>
     <w:p>
@@ -427,7 +368,7 @@
     </w:p>
     <w:p>
       <w:r>
-        <w:t>Drafts save automatically to Mad Minds/07_People/&lt;your-name&gt;/ (reports/, plans/, data/, notes/). When something's finished, say “publish this to the team” and Claude copies the final version into the shared folder. Every session reads fresh from Drive — no syncing, no local files.</w:t>
+        <w:t>Drafts save to Mad Minds/07_People/&lt;your-name&gt;/. Say “publish this to the team” to copy a finished version into the shared folder. Every session reads fresh from Drive.</w:t>
       </w:r>
     </w:p>
     <w:p>
@@ -444,7 +385,7 @@
         <w:pStyle w:val="ListBullet"/>
       </w:pPr>
       <w:r>
-        <w:t>A connector won't sign in (a localhost page won't load, then an error) → screenshot it and tell Nikolaj.</w:t>
+        <w:t>A connector won't connect → screenshot it and tell Nikolaj.</w:t>
       </w:r>
     </w:p>
     <w:p>
@@ -452,15 +393,7 @@
         <w:pStyle w:val="ListBullet"/>
       </w:pPr>
       <w:r>
-        <w:t>Claude says it needs a value and pauses → answer it; Claude saves it to Drive so it won't ask again.</w:t>
-      </w:r>
-    </w:p>
-    <w:p>
-      <w:pPr>
-        <w:pStyle w:val="ListBullet"/>
-      </w:pPr>
-      <w:r>
-        <w:t>Don't use the Connectors panel “Install”/“Add custom connector” for the plugin connectors — sign in via /setup-marketing instead.</w:t>
+        <w:t>Use Add custom connector (URL) for Search Console and Google Ads — not the “Install” button and not an in-session sign-in link.</w:t>
       </w:r>
     </w:p>
     <w:sectPr>

</xml_diff>

<commit_message>
Add skill-first routing rule to account-conventions + setup guides (v0.8.3)
</commit_message>
<xml_diff>
--- a/Mad Minds - Employee Setup Guide.docx
+++ b/Mad Minds - Employee Setup Guide.docx
@@ -1055,6 +1055,26 @@
           <w:highlight w:val="green"/>
         </w:rPr>
         <w:t>- Load the account-conventions skill at the start of any marketing task.</w:t>
+      </w:r>
+    </w:p>
+    <w:p>
+      <w:pPr>
+        <w:spacing w:line="240" w:lineRule="auto"/>
+        <w:rPr>
+          <w:rFonts w:ascii="Consolas" w:eastAsia="Consolas" w:hAnsi="Consolas" w:cs="Consolas"/>
+          <w:sz w:val="18"/>
+          <w:szCs w:val="18"/>
+          <w:highlight w:val="green"/>
+        </w:rPr>
+      </w:pPr>
+      <w:r>
+        <w:rPr>
+          <w:rFonts w:ascii="Consolas" w:eastAsia="Consolas" w:hAnsi="Consolas" w:cs="Consolas"/>
+          <w:sz w:val="18"/>
+          <w:szCs w:val="18"/>
+          <w:highlight w:val="green"/>
+        </w:rPr>
+        <w:t>- Skill-first routing: At the start of every task — before pulling data or building anything — scan the available skills list for any skill whose description matches the request. This explicitly includes the claude-ads skills (ads-math, ads-google, ads-meta, ads-budget, ads-audit, ads-creative, ads-landing, etc.) and the onlineminds-marketing skills. If one or more are relevant, use them (chain them when several apply) instead of doing the work by hand. If you deliberately skip a clearly-relevant skill, state which one and why in one line.</w:t>
       </w:r>
     </w:p>
     <w:p>

</xml_diff>